<commit_message>
add modif doc E6 Jef Ly
</commit_message>
<xml_diff>
--- a/doc/Epreuve E6 Jef Ly/Épreuve E6 - description réalisation pro GSB compte rendu - Jef Ly - 2026 - Copie.docx
+++ b/doc/Epreuve E6 Jef Ly/Épreuve E6 - description réalisation pro GSB compte rendu - Jef Ly - 2026 - Copie.docx
@@ -212,9 +212,9 @@
         <w:tblLook w:firstRow="0" w:noVBand="0" w:lastRow="0" w:firstColumn="0" w:lastColumn="0" w:noHBand="0" w:val="0000"/>
       </w:tblPr>
       <w:tblGrid>
-        <w:gridCol w:w="3113"/>
+        <w:gridCol w:w="3112"/>
         <w:gridCol w:w="4111"/>
-        <w:gridCol w:w="715"/>
+        <w:gridCol w:w="716"/>
         <w:gridCol w:w="1984"/>
       </w:tblGrid>
       <w:tr>
@@ -287,7 +287,15 @@
                 <w:b/>
                 <w:sz w:val="20"/>
               </w:rPr>
-              <w:t>N° réalisation : 1</w:t>
+              <w:t xml:space="preserve">N° réalisation : </w:t>
+            </w:r>
+            <w:r>
+              <w:rPr>
+                <w:rFonts w:ascii="Arial" w:hAnsi="Arial"/>
+                <w:b/>
+                <w:sz w:val="20"/>
+              </w:rPr>
+              <w:t>2</w:t>
             </w:r>
           </w:p>
         </w:tc>
@@ -299,7 +307,7 @@
         </w:trPr>
         <w:tc>
           <w:tcPr>
-            <w:tcW w:w="7224" w:type="dxa"/>
+            <w:tcW w:w="7223" w:type="dxa"/>
             <w:gridSpan w:val="2"/>
             <w:tcBorders>
               <w:top w:val="single" w:sz="4" w:space="0" w:color="000000"/>
@@ -330,7 +338,7 @@
         </w:tc>
         <w:tc>
           <w:tcPr>
-            <w:tcW w:w="2699" w:type="dxa"/>
+            <w:tcW w:w="2700" w:type="dxa"/>
             <w:gridSpan w:val="2"/>
             <w:tcBorders>
               <w:top w:val="single" w:sz="4" w:space="0" w:color="000000"/>
@@ -378,7 +386,7 @@
         </w:trPr>
         <w:tc>
           <w:tcPr>
-            <w:tcW w:w="3113" w:type="dxa"/>
+            <w:tcW w:w="3112" w:type="dxa"/>
             <w:tcBorders>
               <w:top w:val="single" w:sz="4" w:space="0" w:color="000000"/>
               <w:left w:val="single" w:sz="4" w:space="0" w:color="000000"/>
@@ -559,7 +567,7 @@
         </w:tc>
         <w:tc>
           <w:tcPr>
-            <w:tcW w:w="2699" w:type="dxa"/>
+            <w:tcW w:w="2700" w:type="dxa"/>
             <w:gridSpan w:val="2"/>
             <w:tcBorders>
               <w:top w:val="single" w:sz="4" w:space="0" w:color="000000"/>
@@ -869,14 +877,16 @@
             </w:r>
             <w:bookmarkStart w:id="6" w:name="CheckBox_Copie_1_Copie_1"/>
             <w:bookmarkStart w:id="7" w:name="CheckBox_Copie_1_Copie_1_Copie_1"/>
-            <w:bookmarkStart w:id="8" w:name="CheckBox_Copie_1_Copie_1_Copie_1"/>
-            <w:bookmarkStart w:id="9" w:name="CheckBox_Copie_1_Copie_1"/>
-            <w:bookmarkStart w:id="10" w:name="CheckBox_Copie_1"/>
+            <w:bookmarkStart w:id="8" w:name="CheckBox_Copie_1_Copie_1_Copie_1_Copie_1"/>
+            <w:bookmarkStart w:id="9" w:name="CheckBox_Copie_1_Copie_1_Copie_1"/>
+            <w:bookmarkStart w:id="10" w:name="CheckBox_Copie_1_Copie_1"/>
+            <w:bookmarkStart w:id="11" w:name="CheckBox_Copie_1"/>
             <w:bookmarkEnd w:id="6"/>
             <w:bookmarkEnd w:id="7"/>
             <w:bookmarkEnd w:id="8"/>
             <w:bookmarkEnd w:id="9"/>
             <w:bookmarkEnd w:id="10"/>
+            <w:bookmarkEnd w:id="11"/>
             <w:r>
               <w:rPr>
                 <w:b/>
@@ -916,9 +926,9 @@
               </w:rPr>
               <w:fldChar w:fldCharType="separate"/>
             </w:r>
-            <w:bookmarkStart w:id="11" w:name="CheckBox_Copie_2"/>
             <w:bookmarkStart w:id="12" w:name="CheckBox_Copie_2"/>
-            <w:bookmarkEnd w:id="12"/>
+            <w:bookmarkStart w:id="13" w:name="CheckBox_Copie_2"/>
+            <w:bookmarkEnd w:id="13"/>
             <w:r>
               <w:rPr>
                 <w:b/>
@@ -934,16 +944,18 @@
               </w:rPr>
               <w:fldChar w:fldCharType="end"/>
             </w:r>
-            <w:bookmarkStart w:id="13" w:name="CheckBox_Copie_2_Copie_1"/>
-            <w:bookmarkStart w:id="14" w:name="CheckBox_Copie_2_Copie_1_Copie_1"/>
+            <w:bookmarkStart w:id="14" w:name="CheckBox_Copie_2_Copie_1"/>
             <w:bookmarkStart w:id="15" w:name="CheckBox_Copie_2_Copie_1_Copie_1"/>
-            <w:bookmarkStart w:id="16" w:name="CheckBox_Copie_2_Copie_1"/>
-            <w:bookmarkStart w:id="17" w:name="CheckBox_Copie_2"/>
-            <w:bookmarkEnd w:id="13"/>
+            <w:bookmarkStart w:id="16" w:name="CheckBox_Copie_2_Copie_1_Copie_1_Copie_1"/>
+            <w:bookmarkStart w:id="17" w:name="CheckBox_Copie_2_Copie_1_Copie_1"/>
+            <w:bookmarkStart w:id="18" w:name="CheckBox_Copie_2_Copie_1"/>
+            <w:bookmarkStart w:id="19" w:name="CheckBox_Copie_2"/>
             <w:bookmarkEnd w:id="14"/>
             <w:bookmarkEnd w:id="15"/>
             <w:bookmarkEnd w:id="16"/>
             <w:bookmarkEnd w:id="17"/>
+            <w:bookmarkEnd w:id="18"/>
+            <w:bookmarkEnd w:id="19"/>
             <w:r>
               <w:rPr>
                 <w:b/>
@@ -1043,9 +1055,9 @@
               </w:rPr>
               <w:fldChar w:fldCharType="separate"/>
             </w:r>
-            <w:bookmarkStart w:id="18" w:name="CheckBox_Copie_3"/>
-            <w:bookmarkStart w:id="19" w:name="CheckBox_Copie_3"/>
-            <w:bookmarkEnd w:id="19"/>
+            <w:bookmarkStart w:id="20" w:name="CheckBox_Copie_3"/>
+            <w:bookmarkStart w:id="21" w:name="CheckBox_Copie_3"/>
+            <w:bookmarkEnd w:id="21"/>
             <w:r>
               <w:rPr>
                 <w:rFonts w:cs="Arial" w:ascii="Arial" w:hAnsi="Arial"/>
@@ -1059,16 +1071,18 @@
               </w:rPr>
               <w:fldChar w:fldCharType="end"/>
             </w:r>
-            <w:bookmarkStart w:id="20" w:name="CheckBox_Copie_3_Copie_1"/>
-            <w:bookmarkStart w:id="21" w:name="CheckBox_Copie_3_Copie_1_Copie_1"/>
-            <w:bookmarkStart w:id="22" w:name="CheckBox_Copie_3_Copie_1_Copie_1"/>
-            <w:bookmarkStart w:id="23" w:name="CheckBox_Copie_3_Copie_1"/>
-            <w:bookmarkStart w:id="24" w:name="CheckBox_Copie_3"/>
-            <w:bookmarkEnd w:id="20"/>
-            <w:bookmarkEnd w:id="21"/>
+            <w:bookmarkStart w:id="22" w:name="CheckBox_Copie_3_Copie_1"/>
+            <w:bookmarkStart w:id="23" w:name="CheckBox_Copie_3_Copie_1_Copie_1"/>
+            <w:bookmarkStart w:id="24" w:name="CheckBox_Copie_3_Copie_1_Copie_1_Copie_1"/>
+            <w:bookmarkStart w:id="25" w:name="CheckBox_Copie_3_Copie_1_Copie_1"/>
+            <w:bookmarkStart w:id="26" w:name="CheckBox_Copie_3_Copie_1"/>
+            <w:bookmarkStart w:id="27" w:name="CheckBox_Copie_3"/>
             <w:bookmarkEnd w:id="22"/>
             <w:bookmarkEnd w:id="23"/>
             <w:bookmarkEnd w:id="24"/>
+            <w:bookmarkEnd w:id="25"/>
+            <w:bookmarkEnd w:id="26"/>
+            <w:bookmarkEnd w:id="27"/>
             <w:r>
               <w:rPr>
                 <w:rFonts w:cs="Arial" w:ascii="Arial" w:hAnsi="Arial"/>
@@ -1133,9 +1147,9 @@
               </w:rPr>
               <w:fldChar w:fldCharType="separate"/>
             </w:r>
-            <w:bookmarkStart w:id="25" w:name="CheckBox_Copie_4"/>
-            <w:bookmarkStart w:id="26" w:name="CheckBox_Copie_4"/>
-            <w:bookmarkEnd w:id="26"/>
+            <w:bookmarkStart w:id="28" w:name="CheckBox_Copie_4"/>
+            <w:bookmarkStart w:id="29" w:name="CheckBox_Copie_4"/>
+            <w:bookmarkEnd w:id="29"/>
             <w:r>
               <w:rPr>
                 <w:rFonts w:cs="Arial" w:ascii="Arial" w:hAnsi="Arial"/>
@@ -1149,16 +1163,18 @@
               </w:rPr>
               <w:fldChar w:fldCharType="end"/>
             </w:r>
-            <w:bookmarkStart w:id="27" w:name="CheckBox_Copie_4_Copie_1"/>
-            <w:bookmarkStart w:id="28" w:name="CheckBox_Copie_4_Copie_1_Copie_1"/>
-            <w:bookmarkStart w:id="29" w:name="CheckBox_Copie_4_Copie_1_Copie_1"/>
             <w:bookmarkStart w:id="30" w:name="CheckBox_Copie_4_Copie_1"/>
-            <w:bookmarkStart w:id="31" w:name="CheckBox_Copie_4"/>
-            <w:bookmarkEnd w:id="27"/>
-            <w:bookmarkEnd w:id="28"/>
-            <w:bookmarkEnd w:id="29"/>
+            <w:bookmarkStart w:id="31" w:name="CheckBox_Copie_4_Copie_1_Copie_1"/>
+            <w:bookmarkStart w:id="32" w:name="CheckBox_Copie_4_Copie_1_Copie_1_Copie_1"/>
+            <w:bookmarkStart w:id="33" w:name="CheckBox_Copie_4_Copie_1_Copie_1"/>
+            <w:bookmarkStart w:id="34" w:name="CheckBox_Copie_4_Copie_1"/>
+            <w:bookmarkStart w:id="35" w:name="CheckBox_Copie_4"/>
             <w:bookmarkEnd w:id="30"/>
             <w:bookmarkEnd w:id="31"/>
+            <w:bookmarkEnd w:id="32"/>
+            <w:bookmarkEnd w:id="33"/>
+            <w:bookmarkEnd w:id="34"/>
+            <w:bookmarkEnd w:id="35"/>
             <w:r>
               <w:rPr>
                 <w:rFonts w:cs="Arial" w:ascii="Arial" w:hAnsi="Arial"/>
@@ -1222,9 +1238,9 @@
               </w:rPr>
               <w:fldChar w:fldCharType="separate"/>
             </w:r>
-            <w:bookmarkStart w:id="32" w:name="CheckBox_Copie_5"/>
-            <w:bookmarkStart w:id="33" w:name="CheckBox_Copie_5"/>
-            <w:bookmarkEnd w:id="33"/>
+            <w:bookmarkStart w:id="36" w:name="CheckBox_Copie_5"/>
+            <w:bookmarkStart w:id="37" w:name="CheckBox_Copie_5"/>
+            <w:bookmarkEnd w:id="37"/>
             <w:r>
               <w:rPr>
                 <w:rFonts w:cs="Arial" w:ascii="Arial" w:hAnsi="Arial"/>
@@ -1238,16 +1254,18 @@
               </w:rPr>
               <w:fldChar w:fldCharType="end"/>
             </w:r>
-            <w:bookmarkStart w:id="34" w:name="CheckBox_Copie_5_Copie_1"/>
-            <w:bookmarkStart w:id="35" w:name="CheckBox_Copie_5_Copie_1_Copie_1"/>
-            <w:bookmarkStart w:id="36" w:name="CheckBox_Copie_5_Copie_1_Copie_1"/>
-            <w:bookmarkStart w:id="37" w:name="CheckBox_Copie_5_Copie_1"/>
-            <w:bookmarkStart w:id="38" w:name="CheckBox_Copie_5"/>
-            <w:bookmarkEnd w:id="34"/>
-            <w:bookmarkEnd w:id="35"/>
-            <w:bookmarkEnd w:id="36"/>
-            <w:bookmarkEnd w:id="37"/>
+            <w:bookmarkStart w:id="38" w:name="CheckBox_Copie_5_Copie_1"/>
+            <w:bookmarkStart w:id="39" w:name="CheckBox_Copie_5_Copie_1_Copie_1"/>
+            <w:bookmarkStart w:id="40" w:name="CheckBox_Copie_5_Copie_1_Copie_1_Copie_1"/>
+            <w:bookmarkStart w:id="41" w:name="CheckBox_Copie_5_Copie_1_Copie_1"/>
+            <w:bookmarkStart w:id="42" w:name="CheckBox_Copie_5_Copie_1"/>
+            <w:bookmarkStart w:id="43" w:name="CheckBox_Copie_5"/>
             <w:bookmarkEnd w:id="38"/>
+            <w:bookmarkEnd w:id="39"/>
+            <w:bookmarkEnd w:id="40"/>
+            <w:bookmarkEnd w:id="41"/>
+            <w:bookmarkEnd w:id="42"/>
+            <w:bookmarkEnd w:id="43"/>
             <w:r>
               <w:rPr>
                 <w:rFonts w:cs="Arial" w:ascii="Arial" w:hAnsi="Arial"/>
@@ -2270,27 +2288,7 @@
                 <w:sz w:val="20"/>
                 <w:szCs w:val="20"/>
               </w:rPr>
-              <w:t xml:space="preserve">- Gestion du catalogue produit : Les administrateurs doivent pouvoir créer, modifier et supprimer des produits et catégories via </w:t>
-            </w:r>
-            <w:r>
-              <w:rPr>
-                <w:rFonts w:ascii="Calibri" w:hAnsi="Calibri"/>
-                <w:b/>
-                <w:bCs/>
-                <w:sz w:val="20"/>
-                <w:szCs w:val="20"/>
-              </w:rPr>
-              <w:t xml:space="preserve">un espace d'administration, </w:t>
-            </w:r>
-            <w:r>
-              <w:rPr>
-                <w:rFonts w:ascii="Calibri" w:hAnsi="Calibri"/>
-                <w:b/>
-                <w:bCs/>
-                <w:sz w:val="20"/>
-                <w:szCs w:val="20"/>
-              </w:rPr>
-              <w:t xml:space="preserve"> avec gestion des stocks et alertes de seuil de rupture.</w:t>
+              <w:t>- Gestion du catalogue produit : Les administrateurs doivent pouvoir créer, modifier et supprimer des produits et catégories via un espace d'administration,  avec gestion des stocks et alertes de seuil de rupture.</w:t>
             </w:r>
           </w:p>
           <w:p>
@@ -2780,7 +2778,27 @@
                 <w:sz w:val="20"/>
                 <w:szCs w:val="20"/>
               </w:rPr>
-              <w:t>- Gestion Produit simple</w:t>
+              <w:t xml:space="preserve">- </w:t>
+            </w:r>
+            <w:r>
+              <w:rPr>
+                <w:rFonts w:ascii="Calibri" w:hAnsi="Calibri"/>
+                <w:b/>
+                <w:bCs/>
+                <w:sz w:val="20"/>
+                <w:szCs w:val="20"/>
+              </w:rPr>
+              <w:t xml:space="preserve">USR2A </w:t>
+            </w:r>
+            <w:r>
+              <w:rPr>
+                <w:rFonts w:ascii="Calibri" w:hAnsi="Calibri"/>
+                <w:b/>
+                <w:bCs/>
+                <w:sz w:val="20"/>
+                <w:szCs w:val="20"/>
+              </w:rPr>
+              <w:t>Gestion Produit simple</w:t>
             </w:r>
           </w:p>
           <w:p>
@@ -2804,7 +2822,27 @@
                 <w:sz w:val="20"/>
                 <w:szCs w:val="20"/>
               </w:rPr>
-              <w:t>- Gestion Produit associé</w:t>
+              <w:t xml:space="preserve">- </w:t>
+            </w:r>
+            <w:r>
+              <w:rPr>
+                <w:rFonts w:ascii="Calibri" w:hAnsi="Calibri"/>
+                <w:b/>
+                <w:bCs/>
+                <w:sz w:val="20"/>
+                <w:szCs w:val="20"/>
+              </w:rPr>
+              <w:t xml:space="preserve">USR2C </w:t>
+            </w:r>
+            <w:r>
+              <w:rPr>
+                <w:rFonts w:ascii="Calibri" w:hAnsi="Calibri"/>
+                <w:b/>
+                <w:bCs/>
+                <w:sz w:val="20"/>
+                <w:szCs w:val="20"/>
+              </w:rPr>
+              <w:t>Gestion Produit associé</w:t>
             </w:r>
           </w:p>
           <w:p>
@@ -2816,19 +2854,42 @@
               </w:numPr>
               <w:ind w:hanging="0" w:left="720"/>
               <w:rPr>
-                <w:sz w:val="20"/>
-                <w:szCs w:val="20"/>
-              </w:rPr>
-            </w:pPr>
-            <w:r>
-              <w:rPr>
-                <w:rFonts w:ascii="Calibri" w:hAnsi="Calibri"/>
-                <w:b/>
-                <w:bCs/>
-                <w:sz w:val="20"/>
-                <w:szCs w:val="20"/>
-              </w:rPr>
-              <w:t>- Modif Produit</w:t>
+                <w:rFonts w:ascii="Calibri" w:hAnsi="Calibri"/>
+                <w:b/>
+                <w:bCs/>
+                <w:sz w:val="20"/>
+                <w:szCs w:val="20"/>
+              </w:rPr>
+            </w:pPr>
+            <w:r>
+              <w:rPr>
+                <w:rFonts w:ascii="Calibri" w:hAnsi="Calibri"/>
+                <w:b/>
+                <w:bCs/>
+                <w:sz w:val="20"/>
+                <w:szCs w:val="20"/>
+              </w:rPr>
+              <w:t xml:space="preserve">- </w:t>
+            </w:r>
+            <w:r>
+              <w:rPr>
+                <w:rFonts w:ascii="Calibri" w:hAnsi="Calibri"/>
+                <w:b/>
+                <w:bCs/>
+                <w:sz w:val="20"/>
+                <w:szCs w:val="20"/>
+              </w:rPr>
+              <w:t xml:space="preserve">USR4 </w:t>
+            </w:r>
+            <w:r>
+              <w:rPr>
+                <w:rFonts w:ascii="Calibri" w:hAnsi="Calibri"/>
+                <w:b/>
+                <w:bCs/>
+                <w:sz w:val="20"/>
+                <w:szCs w:val="20"/>
+              </w:rPr>
+              <w:t>Consulter liste Produit</w:t>
             </w:r>
           </w:p>
           <w:p>
@@ -2840,19 +2901,41 @@
               </w:numPr>
               <w:ind w:hanging="0" w:left="720"/>
               <w:rPr>
-                <w:sz w:val="20"/>
-                <w:szCs w:val="20"/>
-              </w:rPr>
-            </w:pPr>
-            <w:r>
-              <w:rPr>
-                <w:rFonts w:ascii="Calibri" w:hAnsi="Calibri"/>
-                <w:b/>
-                <w:bCs/>
-                <w:sz w:val="20"/>
-                <w:szCs w:val="20"/>
-              </w:rPr>
-              <w:t>- Consulter liste Produit</w:t>
+                <w:b/>
+                <w:bCs/>
+                <w:sz w:val="20"/>
+                <w:szCs w:val="20"/>
+              </w:rPr>
+            </w:pPr>
+            <w:r>
+              <w:rPr>
+                <w:rFonts w:ascii="Calibri" w:hAnsi="Calibri"/>
+                <w:b/>
+                <w:bCs/>
+                <w:sz w:val="20"/>
+                <w:szCs w:val="20"/>
+              </w:rPr>
+              <w:t xml:space="preserve">- </w:t>
+            </w:r>
+            <w:r>
+              <w:rPr>
+                <w:rFonts w:ascii="Calibri" w:hAnsi="Calibri"/>
+                <w:b/>
+                <w:bCs/>
+                <w:sz w:val="20"/>
+                <w:szCs w:val="20"/>
+              </w:rPr>
+              <w:t xml:space="preserve">USR5 </w:t>
+            </w:r>
+            <w:r>
+              <w:rPr>
+                <w:rFonts w:ascii="Calibri" w:hAnsi="Calibri"/>
+                <w:b/>
+                <w:bCs/>
+                <w:sz w:val="20"/>
+                <w:szCs w:val="20"/>
+              </w:rPr>
+              <w:t>Consulter détail d’un produit</w:t>
             </w:r>
           </w:p>
           <w:p>
@@ -2876,7 +2959,27 @@
                 <w:sz w:val="20"/>
                 <w:szCs w:val="20"/>
               </w:rPr>
-              <w:t>- Consulter détail d’un produit</w:t>
+              <w:t xml:space="preserve">- </w:t>
+            </w:r>
+            <w:r>
+              <w:rPr>
+                <w:rFonts w:ascii="Calibri" w:hAnsi="Calibri"/>
+                <w:b/>
+                <w:bCs/>
+                <w:sz w:val="20"/>
+                <w:szCs w:val="20"/>
+              </w:rPr>
+              <w:t xml:space="preserve">USR12 </w:t>
+            </w:r>
+            <w:r>
+              <w:rPr>
+                <w:rFonts w:ascii="Calibri" w:hAnsi="Calibri"/>
+                <w:b/>
+                <w:bCs/>
+                <w:sz w:val="20"/>
+                <w:szCs w:val="20"/>
+              </w:rPr>
+              <w:t>Modif Produit</w:t>
             </w:r>
           </w:p>
           <w:p>
@@ -3177,7 +3280,7 @@
       </w:r>
       <w:r>
         <w:rPr>
-          <w:rStyle w:val="Caractresdenotedebasdepageuser"/>
+          <w:rStyle w:val="Caractresdenotedebasdepage"/>
         </w:rPr>
         <w:t xml:space="preserve"> </w:t>
       </w:r>
@@ -4095,8 +4198,8 @@
       <w:lang w:eastAsia="ar-SA"/>
     </w:rPr>
   </w:style>
-  <w:style w:type="character" w:styleId="Caractresdenotedebasdepageuser">
-    <w:name w:val="Caractères de note de bas de page (user)"/>
+  <w:style w:type="character" w:styleId="Caractresdenotedebasdepage">
+    <w:name w:val="Caractères de note de bas de page"/>
     <w:semiHidden/>
     <w:qFormat/>
     <w:rsid w:val="00226081"/>
@@ -4104,8 +4207,8 @@
       <w:vertAlign w:val="superscript"/>
     </w:rPr>
   </w:style>
-  <w:style w:type="character" w:styleId="Caractresdenotedebasdepage">
-    <w:name w:val="Caractères de note de bas de page"/>
+  <w:style w:type="character" w:styleId="Caractresdenotedebasdepageuser">
+    <w:name w:val="Caractères de note de bas de page (user)"/>
     <w:qFormat/>
     <w:rPr>
       <w:vertAlign w:val="superscript"/>
@@ -4204,15 +4307,15 @@
       <w:lang w:eastAsia="ar-SA"/>
     </w:rPr>
   </w:style>
-  <w:style w:type="character" w:styleId="Caractresdenotedefin">
-    <w:name w:val="Caractères de note de fin"/>
+  <w:style w:type="character" w:styleId="Caractresdenotedefinuser">
+    <w:name w:val="Caractères de note de fin (user)"/>
     <w:qFormat/>
     <w:rPr>
       <w:vertAlign w:val="superscript"/>
     </w:rPr>
   </w:style>
-  <w:style w:type="character" w:styleId="Caractresdenotedefinuser">
-    <w:name w:val="Caractères de note de fin (user)"/>
+  <w:style w:type="character" w:styleId="Caractresdenotedefin">
+    <w:name w:val="Caractères de note de fin"/>
     <w:qFormat/>
     <w:rPr>
       <w:vertAlign w:val="superscript"/>
@@ -4232,15 +4335,15 @@
       <w:bCs/>
     </w:rPr>
   </w:style>
-  <w:style w:type="character" w:styleId="Textesourceuser">
-    <w:name w:val="Texte source (user)"/>
+  <w:style w:type="character" w:styleId="Textesource">
+    <w:name w:val="Texte source"/>
     <w:qFormat/>
     <w:rPr>
       <w:rFonts w:ascii="Liberation Mono" w:hAnsi="Liberation Mono" w:eastAsia="Liberation Mono" w:cs="Liberation Mono"/>
     </w:rPr>
   </w:style>
-  <w:style w:type="character" w:styleId="Caractresdenumrotationuser">
-    <w:name w:val="Caractères de numérotation (user)"/>
+  <w:style w:type="character" w:styleId="Caractresdenumrotation">
+    <w:name w:val="Caractères de numérotation"/>
     <w:qFormat/>
     <w:rPr/>
   </w:style>
@@ -4252,15 +4355,15 @@
       <w:iCs/>
     </w:rPr>
   </w:style>
-  <w:style w:type="character" w:styleId="Pucesuser">
-    <w:name w:val="Puces (user)"/>
+  <w:style w:type="character" w:styleId="Puces">
+    <w:name w:val="Puces"/>
     <w:qFormat/>
     <w:rPr>
       <w:rFonts w:ascii="OpenSymbol" w:hAnsi="OpenSymbol" w:eastAsia="OpenSymbol" w:cs="OpenSymbol"/>
     </w:rPr>
   </w:style>
-  <w:style w:type="character" w:styleId="Puces">
-    <w:name w:val="Puces"/>
+  <w:style w:type="character" w:styleId="Pucesuser">
+    <w:name w:val="Puces (user)"/>
     <w:qFormat/>
     <w:rPr>
       <w:rFonts w:ascii="OpenSymbol" w:hAnsi="OpenSymbol" w:eastAsia="OpenSymbol" w:cs="OpenSymbol"/>
@@ -4446,8 +4549,8 @@
       <w:lang w:val="fr-FR" w:eastAsia="ar-SA" w:bidi="ar-SA"/>
     </w:rPr>
   </w:style>
-  <w:style w:type="numbering" w:styleId="Pasdeliste" w:default="1">
-    <w:name w:val="Pas de liste"/>
+  <w:style w:type="numbering" w:styleId="Pasdelisteuser" w:default="1">
+    <w:name w:val="Pas de liste (user)"/>
     <w:uiPriority w:val="99"/>
     <w:semiHidden/>
     <w:unhideWhenUsed/>

</xml_diff>